<commit_message>
a  second nth commit
</commit_message>
<xml_diff>
--- a/wordi1.docx
+++ b/wordi1.docx
@@ -41,9 +41,33 @@
         </w:rPr>
         <w:t>there !</w:t>
       </w:r>
+      <w:proofErr w:type="gramEnd"/>
+      <w:r>
+        <w:rPr>
+          <w:sz w:val="52"/>
+          <w:szCs w:val="52"/>
+        </w:rPr>
+        <w:t xml:space="preserve"> </w:t>
+      </w:r>
+    </w:p>
+    <w:p/>
+    <w:p>
+      <w:pPr>
+        <w:pStyle w:val="1"/>
+        <w:rPr>
+          <w:sz w:val="52"/>
+          <w:szCs w:val="52"/>
+        </w:rPr>
+      </w:pPr>
+      <w:r>
+        <w:rPr>
+          <w:sz w:val="52"/>
+          <w:szCs w:val="52"/>
+        </w:rPr>
+        <w:t>Some modified</w:t>
+      </w:r>
       <w:bookmarkStart w:id="0" w:name="_GoBack"/>
       <w:bookmarkEnd w:id="0"/>
-      <w:proofErr w:type="gramEnd"/>
     </w:p>
     <w:sectPr>
       <w:pgSz w:w="12240" w:h="15840"/>

</xml_diff>